<commit_message>
Revisión U10: CEs alineados, Fallo B del lab, DNS del boletín y fixes de puntos
</commit_message>
<xml_diff>
--- a/docx/10-acl-seguridad/10-acl-seguridad.docx
+++ b/docx/10-acl-seguridad/10-acl-seguridad.docx
@@ -791,18 +791,18 @@
               <w:pStyle w:val="Compact"/>
             </w:pPr>
             <w:r>
-              <w:t xml:space="preserve">Filtrado de tráfico</w:t>
-            </w:r>
-          </w:p>
-        </w:tc>
-        <w:tc>
-          <w:tcPr/>
-          <w:p>
-            <w:pPr>
-              <w:pStyle w:val="Compact"/>
-            </w:pPr>
-            <w:r>
-              <w:t xml:space="preserve">✅ Puntos 1-3 + ⚡ Laboratorio (punto 6)</w:t>
+              <w:t xml:space="preserve">Filtrado de tráfico (ACLs)</w:t>
+            </w:r>
+          </w:p>
+        </w:tc>
+        <w:tc>
+          <w:tcPr/>
+          <w:p>
+            <w:pPr>
+              <w:pStyle w:val="Compact"/>
+            </w:pPr>
+            <w:r>
+              <w:t xml:space="preserve">✅ Puntos 1-4 + ⚡ Laboratorio (punto 6)</w:t>
             </w:r>
           </w:p>
         </w:tc>
@@ -838,41 +838,6 @@
             </w:pPr>
             <w:r>
               <w:t xml:space="preserve">✅ Puntos 2-4 + 🧠 Atrévete a pensar (punto 6)</w:t>
-            </w:r>
-          </w:p>
-        </w:tc>
-      </w:tr>
-      <w:tr>
-        <w:tc>
-          <w:tcPr/>
-          <w:p>
-            <w:pPr>
-              <w:pStyle w:val="Compact"/>
-            </w:pPr>
-            <w:r>
-              <w:t xml:space="preserve">b)</w:t>
-            </w:r>
-          </w:p>
-        </w:tc>
-        <w:tc>
-          <w:tcPr/>
-          <w:p>
-            <w:pPr>
-              <w:pStyle w:val="Compact"/>
-            </w:pPr>
-            <w:r>
-              <w:t xml:space="preserve">Gestión segura del equipo</w:t>
-            </w:r>
-          </w:p>
-        </w:tc>
-        <w:tc>
-          <w:tcPr/>
-          <w:p>
-            <w:pPr>
-              <w:pStyle w:val="Compact"/>
-            </w:pPr>
-            <w:r>
-              <w:t xml:space="preserve">✅ Puntos 1 y 5 + 💬 Entrevista (punto 6)</w:t>
             </w:r>
           </w:p>
         </w:tc>
@@ -1015,7 +980,7 @@
         <w:pStyle w:val="Heading1"/>
       </w:pPr>
       <w:r>
-        <w:t xml:space="preserve">01 — De las rutas a las ACLs</w:t>
+        <w:t xml:space="preserve">1 — De las rutas a las ACLs</w:t>
       </w:r>
     </w:p>
     <w:p>
@@ -1063,7 +1028,7 @@
         <w:t xml:space="preserve"> </w:t>
       </w:r>
       <w:r>
-        <w:t xml:space="preserve">→ 01 · De las rutas a las ACLs</w:t>
+        <w:t xml:space="preserve">→ 1 · De las rutas a las ACLs</w:t>
       </w:r>
     </w:p>
     <w:p>
@@ -2538,7 +2503,7 @@
           <w:rPr>
             <w:rStyle w:val="Hyperlink"/>
           </w:rPr>
-          <w:t xml:space="preserve">02 · ACLs: concepto y tipos</w:t>
+          <w:t xml:space="preserve">2 · ACLs: concepto y tipos</w:t>
         </w:r>
       </w:hyperlink>
     </w:p>
@@ -3609,7 +3574,7 @@
         <w:pStyle w:val="BodyText"/>
       </w:pPr>
       <w:r>
-        <w:t xml:space="preserve">La diferencia práctica importa para el byte en cuestión de eficiencia:</w:t>
+        <w:t xml:space="preserve">La diferencia práctica se resume en la eficiencia:</w:t>
       </w:r>
     </w:p>
     <w:p>
@@ -3810,7 +3775,7 @@
         <w:t xml:space="preserve"> </w:t>
       </w:r>
       <w:r>
-        <w:t xml:space="preserve">“Una ACL por sentido por interfaz. DOS ACLs por interfaz (una in + una out) un día te darán sorpresas: evalúan en sitios distintos de la cadena. Piensa si quieres trocear antes o después de enrutar.”</w:t>
+        <w:t xml:space="preserve">“Una ACL por sentido por interfaz: que convivan la in y la out de una interfaz es normal. Lo que sí debes perder de vista es que evalúan en sitios distintos de la cadena. Piensa si quieres trocear antes o después de enrutar.”</w:t>
       </w:r>
     </w:p>
     <w:p>
@@ -3926,7 +3891,7 @@
         </w:numPr>
       </w:pPr>
       <w:r>
-        <w:t xml:space="preserve">¿En qué se diferencian paran</w:t>
+        <w:t xml:space="preserve">¿Qué diferencia hay entre</w:t>
       </w:r>
       <w:r>
         <w:t xml:space="preserve"> </w:t>
@@ -4645,7 +4610,7 @@
         <w:pStyle w:val="FirstParagraph"/>
       </w:pPr>
       <w:r>
-        <w:t xml:space="preserve">En el punto 6 viste el mapa de los tipos. Ahora toca ensuciarse las manos con la más sencilla: la estándar. Su limitación (solo mira el origen) es la que define su colocación y sus peligros. Manejarla bien es el primer nivel de destreza ACL.</w:t>
+        <w:t xml:space="preserve">En el punto 2 viste el mapa de los tipos. Ahora toca ensuciarse las manos con la más sencilla: la estándar. Su limitación (solo mira el origen) es la que define su colocación y sus peligros. Manejarla bien es el primer nivel de destreza ACL.</w:t>
       </w:r>
     </w:p>
     <w:p>
@@ -4719,7 +4684,7 @@
         <w:pStyle w:val="FirstParagraph"/>
       </w:pPr>
       <w:r>
-        <w:t xml:space="preserve">Pero hay un trampa con la</w:t>
+        <w:t xml:space="preserve">Pero hay una trampa con la</w:t>
       </w:r>
       <w:r>
         <w:t xml:space="preserve"> </w:t>
@@ -5117,10 +5082,7 @@
         <w:t xml:space="preserve">ip route</w:t>
       </w:r>
       <w:r>
-        <w:t xml:space="preserve"> </w:t>
-      </w:r>
-      <w:r>
-        <w:t xml:space="preserve">(punto 3). Dos mundos, dos vocabularios.”</w:t>
+        <w:t xml:space="preserve">, en la unidad de enrutamiento estático. Dos mundos, dos vocabularios.”</w:t>
       </w:r>
     </w:p>
     <w:p>
@@ -6795,16 +6757,7 @@
         <w:t xml:space="preserve">2000-2699</w:t>
       </w:r>
       <w:r>
-        <w:t xml:space="preserve">). Y lee este ejemplo del archivo original: el clásico</w:t>
-      </w:r>
-      <w:r>
-        <w:t xml:space="preserve"> </w:t>
-      </w:r>
-      <w:r>
-        <w:t xml:space="preserve">“web solo hacia Google DNS”</w:t>
-      </w:r>
-      <w:r>
-        <w:t xml:space="preserve">.</w:t>
+        <w:t xml:space="preserve">). Un ejemplo clásico: solo web y DNS hacia donde tú digas.</w:t>
       </w:r>
     </w:p>
     <w:p>
@@ -7543,16 +7496,22 @@
         </w:numPr>
       </w:pPr>
       <w:r>
+        <w:t xml:space="preserve">En el ejemplo se usa</w:t>
+      </w:r>
+      <w:r>
+        <w:t xml:space="preserve"> </w:t>
+      </w:r>
+      <w:r>
         <w:rPr>
           <w:rStyle w:val="VerbatimChar"/>
         </w:rPr>
-        <w:t xml:space="preserve">173.194.0.0</w:t>
-      </w:r>
-      <w:r>
-        <w:t xml:space="preserve"> </w:t>
-      </w:r>
-      <w:r>
-        <w:t xml:space="preserve">sin wildcard más que la de host… espera: aquí sería</w:t>
+        <w:t xml:space="preserve">host 173.194.0.0</w:t>
+      </w:r>
+      <w:r>
+        <w:t xml:space="preserve"> </w:t>
+      </w:r>
+      <w:r>
+        <w:t xml:space="preserve">(una sola IP concreta). Para el rango completo de YouTube/Google hace falta su wildcard:</w:t>
       </w:r>
       <w:r>
         <w:t xml:space="preserve"> </w:t>
@@ -7561,58 +7520,13 @@
         <w:rPr>
           <w:rStyle w:val="VerbatimChar"/>
         </w:rPr>
-        <w:t xml:space="preserve">host 173.194.0.0</w:t>
-      </w:r>
-      <w:r>
-        <w:t xml:space="preserve"> </w:t>
-      </w:r>
-      <w:r>
-        <w:t xml:space="preserve">(esa IP concreta) o</w:t>
-      </w:r>
-      <w:r>
-        <w:t xml:space="preserve"> </w:t>
-      </w:r>
-      <w:r>
-        <w:rPr>
-          <w:rStyle w:val="VerbatimChar"/>
-        </w:rPr>
-        <w:t xml:space="preserve">173.194.0.0 0.0.0.255</w:t>
-      </w:r>
-      <w:r>
-        <w:t xml:space="preserve"> </w:t>
-      </w:r>
-      <w:r>
-        <w:t xml:space="preserve">si quieres todo el bloque de Google. En el ejemplo, cuidado: poner</w:t>
-      </w:r>
-      <w:r>
-        <w:t xml:space="preserve"> </w:t>
-      </w:r>
-      <w:r>
-        <w:rPr>
-          <w:rStyle w:val="VerbatimChar"/>
-        </w:rPr>
-        <w:t xml:space="preserve">host</w:t>
-      </w:r>
-      <w:r>
-        <w:t xml:space="preserve"> </w:t>
-      </w:r>
-      <w:r>
-        <w:t xml:space="preserve">limita a una sola IP — en producción querrías</w:t>
-      </w:r>
-      <w:r>
-        <w:t xml:space="preserve"> </w:t>
-      </w:r>
-      <w:r>
-        <w:rPr>
-          <w:rStyle w:val="VerbatimChar"/>
-        </w:rPr>
         <w:t xml:space="preserve">173.194.0.0 0.0.255.255</w:t>
       </w:r>
       <w:r>
         <w:t xml:space="preserve"> </w:t>
       </w:r>
       <w:r>
-        <w:t xml:space="preserve">para el rango completo de YouTube.</w:t>
+        <w:t xml:space="preserve">— menos líneas, misma idea.</w:t>
       </w:r>
     </w:p>
     <w:p>
@@ -8308,7 +8222,7 @@
         <w:rPr>
           <w:rStyle w:val="CommentTok"/>
         </w:rPr>
-        <w:t xml:space="preserve"># permit udp ... (los retornos UDP van por puertos efímeros, otra historia)</w:t>
+        <w:t xml:space="preserve"># permit udp ...       → los retornos UDP vuelven a puertos efímeros (otra historia)</w:t>
       </w:r>
     </w:p>
     <w:p>
@@ -8548,7 +8462,7 @@
         <w:rPr>
           <w:rStyle w:val="NormalTok"/>
         </w:rPr>
-        <w:t xml:space="preserve"> show access-lists BLOQUEAR_YT    → La nombrada</w:t>
+        <w:t xml:space="preserve"> show access-lists BLOQUEAR_YT_LABORAL    → La nombrada</w:t>
       </w:r>
       <w:r>
         <w:br/>
@@ -10098,7 +10012,7 @@
               <w:pStyle w:val="Compact"/>
             </w:pPr>
             <w:r>
-              <w:t xml:space="preserve">Descarta el tráfico extra pero</w:t>
+              <w:t xml:space="preserve">Descarta el tráfico extra, genera log y contadores, pero</w:t>
             </w:r>
             <w:r>
               <w:t xml:space="preserve"> </w:t>
@@ -11475,7 +11389,22 @@
         <w:t xml:space="preserve">access-list 120 deny tcp 192.168.99.0 0.0.0.255 any eq 23</w:t>
       </w:r>
       <w:r>
-        <w:t xml:space="preserve">. Coincido: origen mi red, destino cualquiera, puerto 23.</w:t>
+        <w:t xml:space="preserve"> </w:t>
+      </w:r>
+      <w:r>
+        <w:t xml:space="preserve">y, justo debajo,</w:t>
+      </w:r>
+      <w:r>
+        <w:t xml:space="preserve"> </w:t>
+      </w:r>
+      <w:r>
+        <w:rPr>
+          <w:rStyle w:val="VerbatimChar"/>
+        </w:rPr>
+        <w:t xml:space="preserve">access-list 120 permit tcp 192.168.99.0 0.0.0.255 any</w:t>
+      </w:r>
+      <w:r>
+        <w:t xml:space="preserve">. Coincido con la primera: origen mi red, destino cualquiera, puerto 23.</w:t>
       </w:r>
       <w:r>
         <w:t xml:space="preserve"> </w:t>
@@ -11725,7 +11654,7 @@
         <w:t xml:space="preserve">origen</w:t>
       </w:r>
       <w:r>
-        <w:t xml:space="preserve">, para no dejar viajar tráfico que luego se descarta. Eso te hace consumir recursos del router en todo el camino.</w:t>
+        <w:t xml:space="preserve">, para descartar lo antes posible y no dejar viajar tráfico que luego se tira. Si te pusieran cerca del destino, ese tráfico habría consumido recursos del router en todo el camino para acabar descartado igual.</w:t>
       </w:r>
     </w:p>
     <w:p>
@@ -12337,7 +12266,7 @@
         <w:t xml:space="preserve"> </w:t>
       </w:r>
       <w:r>
-        <w:t xml:space="preserve">- Fallo B: invierte el orden:</w:t>
+        <w:t xml:space="preserve">- Fallo B: sube a la primera línea de la ACL de invitados un</w:t>
       </w:r>
       <w:r>
         <w:t xml:space="preserve"> </w:t>
@@ -12346,13 +12275,53 @@
         <w:rPr>
           <w:rStyle w:val="VerbatimChar"/>
         </w:rPr>
-        <w:t xml:space="preserve">permit ... eq ftp</w:t>
-      </w:r>
-      <w:r>
-        <w:t xml:space="preserve"> </w:t>
-      </w:r>
-      <w:r>
-        <w:t xml:space="preserve">después del deny tcp con wildcard</w:t>
+        <w:t xml:space="preserve">permit ip 192.168.99.0 0.0.0.255 any</w:t>
+      </w:r>
+      <w:r>
+        <w:t xml:space="preserve"> </w:t>
+      </w:r>
+      <w:r>
+        <w:t xml:space="preserve">(la regla general tapa a las específicas).</w:t>
+      </w:r>
+      <w:r>
+        <w:t xml:space="preserve"> </w:t>
+      </w:r>
+      <w:r>
+        <w:t xml:space="preserve">- Fallo C: aplica la ACL de invitados en la interfaz</w:t>
+      </w:r>
+      <w:r>
+        <w:t xml:space="preserve"> </w:t>
+      </w:r>
+      <w:r>
+        <w:rPr>
+          <w:b/>
+          <w:bCs/>
+        </w:rPr>
+        <w:t xml:space="preserve">errónea</w:t>
+      </w:r>
+      <w:r>
+        <w:t xml:space="preserve"> </w:t>
+      </w:r>
+      <w:r>
+        <w:t xml:space="preserve">(out en G0/0.20 en vez de in en G0/0.99).</w:t>
+      </w:r>
+    </w:p>
+    <w:p>
+      <w:pPr>
+        <w:pStyle w:val="BodyText"/>
+      </w:pPr>
+      <w:r>
+        <w:rPr>
+          <w:b/>
+          <w:bCs/>
+        </w:rPr>
+        <w:t xml:space="preserve">Reto:</w:t>
+      </w:r>
+      <w:r>
+        <w:t xml:space="preserve"> </w:t>
+      </w:r>
+      <w:r>
+        <w:t xml:space="preserve">con pings, navegador y</w:t>
       </w:r>
       <w:r>
         <w:t xml:space="preserve"> </w:t>
@@ -12361,32 +12330,13 @@
         <w:rPr>
           <w:rStyle w:val="VerbatimChar"/>
         </w:rPr>
-        <w:t xml:space="preserve">any eq 20</w:t>
-      </w:r>
-      <w:r>
-        <w:t xml:space="preserve">.</w:t>
-      </w:r>
-      <w:r>
-        <w:t xml:space="preserve"> </w:t>
-      </w:r>
-      <w:r>
-        <w:t xml:space="preserve">- Fallo C: aplica la ACL de invitados en la interfaz</w:t>
-      </w:r>
-      <w:r>
-        <w:t xml:space="preserve"> </w:t>
-      </w:r>
-      <w:r>
-        <w:rPr>
-          <w:b/>
-          <w:bCs/>
-        </w:rPr>
-        <w:t xml:space="preserve">errónea</w:t>
-      </w:r>
-      <w:r>
-        <w:t xml:space="preserve"> </w:t>
-      </w:r>
-      <w:r>
-        <w:t xml:space="preserve">(out en G0/0.20 en vez de in en G0/0.99).</w:t>
+        <w:t xml:space="preserve">show access-lists</w:t>
+      </w:r>
+      <w:r>
+        <w:t xml:space="preserve"> </w:t>
+      </w:r>
+      <w:r>
+        <w:t xml:space="preserve">(mira los contadores de matches), diagnosticar cada fallo y corregir. Documenta síntoma → causa → solución.</w:t>
       </w:r>
     </w:p>
     <w:p>
@@ -12398,13 +12348,13 @@
           <w:b/>
           <w:bCs/>
         </w:rPr>
-        <w:t xml:space="preserve">Reto:</w:t>
-      </w:r>
-      <w:r>
-        <w:t xml:space="preserve"> </w:t>
-      </w:r>
-      <w:r>
-        <w:t xml:space="preserve">con pings, navegador y</w:t>
+        <w:t xml:space="preserve">Fallo intencionado extra:</w:t>
+      </w:r>
+      <w:r>
+        <w:t xml:space="preserve"> </w:t>
+      </w:r>
+      <w:r>
+        <w:t xml:space="preserve">el profesor añade</w:t>
       </w:r>
       <w:r>
         <w:t xml:space="preserve"> </w:t>
@@ -12413,119 +12363,116 @@
         <w:rPr>
           <w:rStyle w:val="VerbatimChar"/>
         </w:rPr>
+        <w:t xml:space="preserve">permit tcp any 192.168.20.10 0.0.0.0 eq 80</w:t>
+      </w:r>
+      <w:r>
+        <w:t xml:space="preserve"> </w:t>
+      </w:r>
+      <w:r>
+        <w:t xml:space="preserve">con</w:t>
+      </w:r>
+      <w:r>
+        <w:t xml:space="preserve"> </w:t>
+      </w:r>
+      <w:r>
+        <w:rPr>
+          <w:b/>
+          <w:bCs/>
+        </w:rPr>
+        <w:t xml:space="preserve">wildcard 0.0.0.0</w:t>
+      </w:r>
+      <w:r>
+        <w:t xml:space="preserve"> </w:t>
+      </w:r>
+      <w:r>
+        <w:t xml:space="preserve">y luego un segundo permit con</w:t>
+      </w:r>
+      <w:r>
+        <w:t xml:space="preserve"> </w:t>
+      </w:r>
+      <w:r>
+        <w:rPr>
+          <w:rStyle w:val="VerbatimChar"/>
+        </w:rPr>
+        <w:t xml:space="preserve">host</w:t>
+      </w:r>
+      <w:r>
+        <w:t xml:space="preserve">. ¿Ambos funcionan? ¿Cuál es la forma canónica? Pista:</w:t>
+      </w:r>
+      <w:r>
+        <w:t xml:space="preserve"> </w:t>
+      </w:r>
+      <w:r>
+        <w:rPr>
+          <w:rStyle w:val="VerbatimChar"/>
+        </w:rPr>
+        <w:t xml:space="preserve">0.0.0.0</w:t>
+      </w:r>
+      <w:r>
+        <w:t xml:space="preserve"> </w:t>
+      </w:r>
+      <w:r>
+        <w:t xml:space="preserve">y</w:t>
+      </w:r>
+      <w:r>
+        <w:t xml:space="preserve"> </w:t>
+      </w:r>
+      <w:r>
+        <w:rPr>
+          <w:rStyle w:val="VerbatimChar"/>
+        </w:rPr>
+        <w:t xml:space="preserve">host</w:t>
+      </w:r>
+      <w:r>
+        <w:t xml:space="preserve"> </w:t>
+      </w:r>
+      <w:r>
+        <w:t xml:space="preserve">son lo mismo; wildcard</w:t>
+      </w:r>
+      <w:r>
+        <w:t xml:space="preserve"> </w:t>
+      </w:r>
+      <w:r>
+        <w:rPr>
+          <w:rStyle w:val="VerbatimChar"/>
+        </w:rPr>
+        <w:t xml:space="preserve">0.0.0.255</w:t>
+      </w:r>
+      <w:r>
+        <w:t xml:space="preserve"> </w:t>
+      </w:r>
+      <w:r>
+        <w:t xml:space="preserve">no.</w:t>
+      </w:r>
+    </w:p>
+    <w:p>
+      <w:pPr>
+        <w:pStyle w:val="BlockText"/>
+      </w:pPr>
+      <w:r>
+        <w:rPr>
+          <w:b/>
+          <w:bCs/>
+        </w:rPr>
+        <w:t xml:space="preserve">Pista 1 (fallo A):</w:t>
+      </w:r>
+      <w:r>
+        <w:t xml:space="preserve"> </w:t>
+      </w:r>
+      <w:r>
+        <w:t xml:space="preserve">contadores en</w:t>
+      </w:r>
+      <w:r>
+        <w:t xml:space="preserve"> </w:t>
+      </w:r>
+      <w:r>
+        <w:rPr>
+          <w:rStyle w:val="VerbatimChar"/>
+        </w:rPr>
         <w:t xml:space="preserve">show access-lists</w:t>
       </w:r>
       <w:r>
-        <w:t xml:space="preserve"> </w:t>
-      </w:r>
-      <w:r>
-        <w:t xml:space="preserve">(mira los contadores de matches), diagnosticar cada fallo y corregir. Documenta síntoma → causa → solución.</w:t>
-      </w:r>
-    </w:p>
-    <w:p>
-      <w:pPr>
-        <w:pStyle w:val="BodyText"/>
-      </w:pPr>
-      <w:r>
-        <w:rPr>
-          <w:b/>
-          <w:bCs/>
-        </w:rPr>
-        <w:t xml:space="preserve">Fallo intencionado extra:</w:t>
-      </w:r>
-      <w:r>
-        <w:t xml:space="preserve"> </w:t>
-      </w:r>
-      <w:r>
-        <w:t xml:space="preserve">el profesor añade</w:t>
-      </w:r>
-      <w:r>
-        <w:t xml:space="preserve"> </w:t>
-      </w:r>
-      <w:r>
-        <w:rPr>
-          <w:rStyle w:val="VerbatimChar"/>
-        </w:rPr>
-        <w:t xml:space="preserve">permit tcp any 192.168.20.10 0.0.0.0 eq 80</w:t>
-      </w:r>
-      <w:r>
-        <w:t xml:space="preserve"> </w:t>
-      </w:r>
-      <w:r>
-        <w:t xml:space="preserve">con</w:t>
-      </w:r>
-      <w:r>
-        <w:t xml:space="preserve"> </w:t>
-      </w:r>
-      <w:r>
-        <w:rPr>
-          <w:b/>
-          <w:bCs/>
-        </w:rPr>
-        <w:t xml:space="preserve">wildcard 0.0.0.0</w:t>
-      </w:r>
-      <w:r>
-        <w:t xml:space="preserve"> </w:t>
-      </w:r>
-      <w:r>
-        <w:t xml:space="preserve">y luego un segundo permit con</w:t>
-      </w:r>
-      <w:r>
-        <w:t xml:space="preserve"> </w:t>
-      </w:r>
-      <w:r>
-        <w:rPr>
-          <w:rStyle w:val="VerbatimChar"/>
-        </w:rPr>
-        <w:t xml:space="preserve">host</w:t>
-      </w:r>
-      <w:r>
-        <w:t xml:space="preserve">. ¿Ambos funcionan? ¿Cuál es la forma canónica? Pista:</w:t>
-      </w:r>
-      <w:r>
-        <w:t xml:space="preserve"> </w:t>
-      </w:r>
-      <w:r>
-        <w:rPr>
-          <w:rStyle w:val="VerbatimChar"/>
-        </w:rPr>
-        <w:t xml:space="preserve">0.0.0.0</w:t>
-      </w:r>
-      <w:r>
-        <w:t xml:space="preserve"> </w:t>
-      </w:r>
-      <w:r>
-        <w:t xml:space="preserve">y</w:t>
-      </w:r>
-      <w:r>
-        <w:t xml:space="preserve"> </w:t>
-      </w:r>
-      <w:r>
-        <w:rPr>
-          <w:rStyle w:val="VerbatimChar"/>
-        </w:rPr>
-        <w:t xml:space="preserve">host</w:t>
-      </w:r>
-      <w:r>
-        <w:t xml:space="preserve"> </w:t>
-      </w:r>
-      <w:r>
-        <w:t xml:space="preserve">son lo mismo; wildcard</w:t>
-      </w:r>
-      <w:r>
-        <w:t xml:space="preserve"> </w:t>
-      </w:r>
-      <w:r>
-        <w:rPr>
-          <w:rStyle w:val="VerbatimChar"/>
-        </w:rPr>
-        <w:t xml:space="preserve">0.0.0.255</w:t>
-      </w:r>
-      <w:r>
-        <w:t xml:space="preserve"> </w:t>
-      </w:r>
-      <w:r>
-        <w:t xml:space="preserve">no.</w:t>
+        <w:t xml:space="preserve">: la primera línea hace match con TODO y ni un paquete pasa. El orden es sentido único.</w:t>
       </w:r>
     </w:p>
     <w:p>
@@ -12537,58 +12484,13 @@
           <w:b/>
           <w:bCs/>
         </w:rPr>
-        <w:t xml:space="preserve">Pista 1 (fallo A):</w:t>
-      </w:r>
-      <w:r>
-        <w:t xml:space="preserve"> </w:t>
-      </w:r>
-      <w:r>
-        <w:t xml:space="preserve">contadores en</w:t>
-      </w:r>
-      <w:r>
-        <w:t xml:space="preserve"> </w:t>
-      </w:r>
-      <w:r>
-        <w:rPr>
-          <w:rStyle w:val="VerbatimChar"/>
-        </w:rPr>
-        <w:t xml:space="preserve">show access-lists</w:t>
-      </w:r>
-      <w:r>
-        <w:t xml:space="preserve">: la primera línea hace match con TODO y ni un paquete pasa. El orden es sentido único.</w:t>
-      </w:r>
-    </w:p>
-    <w:p>
-      <w:pPr>
-        <w:pStyle w:val="BlockText"/>
-      </w:pPr>
-      <w:r>
-        <w:rPr>
-          <w:b/>
-          <w:bCs/>
-        </w:rPr>
         <w:t xml:space="preserve">Pista 2 (fallo B):</w:t>
       </w:r>
       <w:r>
         <w:t xml:space="preserve"> </w:t>
       </w:r>
       <w:r>
-        <w:t xml:space="preserve">el deny con wildcard</w:t>
-      </w:r>
-      <w:r>
-        <w:t xml:space="preserve"> </w:t>
-      </w:r>
-      <w:r>
-        <w:rPr>
-          <w:rStyle w:val="VerbatimChar"/>
-        </w:rPr>
-        <w:t xml:space="preserve">0.0.0.255 eq 20</w:t>
-      </w:r>
-      <w:r>
-        <w:t xml:space="preserve"> </w:t>
-      </w:r>
-      <w:r>
-        <w:t xml:space="preserve">(rango de puertos, no solo 20) hace match antes del permit específico. Lee la ACL línea a línea en orden.</w:t>
+        <w:t xml:space="preserve">la línea general de arriba hace match con TODO antes de que los denies lleguen a contar: lee la ACL línea a línea (lo específico arriba, lo general abajo).</w:t>
       </w:r>
     </w:p>
     <w:p>
@@ -13694,18 +13596,18 @@
               <w:pStyle w:val="Compact"/>
             </w:pPr>
             <w:r>
-              <w:t xml:space="preserve">Filtrado de tráfico</w:t>
-            </w:r>
-          </w:p>
-        </w:tc>
-        <w:tc>
-          <w:tcPr/>
-          <w:p>
-            <w:pPr>
-              <w:pStyle w:val="Compact"/>
-            </w:pPr>
-            <w:r>
-              <w:t xml:space="preserve">✅ Puntos 2-3 y ⚡ Laboratorio</w:t>
+              <w:t xml:space="preserve">Filtrado de tráfico (ACLs)</w:t>
+            </w:r>
+          </w:p>
+        </w:tc>
+        <w:tc>
+          <w:tcPr/>
+          <w:p>
+            <w:pPr>
+              <w:pStyle w:val="Compact"/>
+            </w:pPr>
+            <w:r>
+              <w:t xml:space="preserve">✅ Puntos 1-4 + ⚡ Laboratorio (punto 6)</w:t>
             </w:r>
           </w:p>
         </w:tc>
@@ -13740,42 +13642,7 @@
               <w:pStyle w:val="Compact"/>
             </w:pPr>
             <w:r>
-              <w:t xml:space="preserve">✅ Puntos 2-4 + 🧠 Atrévete (punto 6)</w:t>
-            </w:r>
-          </w:p>
-        </w:tc>
-      </w:tr>
-      <w:tr>
-        <w:tc>
-          <w:tcPr/>
-          <w:p>
-            <w:pPr>
-              <w:pStyle w:val="Compact"/>
-            </w:pPr>
-            <w:r>
-              <w:t xml:space="preserve">b)</w:t>
-            </w:r>
-          </w:p>
-        </w:tc>
-        <w:tc>
-          <w:tcPr/>
-          <w:p>
-            <w:pPr>
-              <w:pStyle w:val="Compact"/>
-            </w:pPr>
-            <w:r>
-              <w:t xml:space="preserve">Acceso y gestión segura del equipo</w:t>
-            </w:r>
-          </w:p>
-        </w:tc>
-        <w:tc>
-          <w:tcPr/>
-          <w:p>
-            <w:pPr>
-              <w:pStyle w:val="Compact"/>
-            </w:pPr>
-            <w:r>
-              <w:t xml:space="preserve">✅ Puntos 1 y 5 + 💬 Entrevista (punto 6)</w:t>
+              <w:t xml:space="preserve">✅ Puntos 2-4 + 🧠 Atrévete a pensar (punto 6)</w:t>
             </w:r>
           </w:p>
         </w:tc>

</xml_diff>